<commit_message>
Update EN Wisdom Stories God→Allah text and regenerate matching illustrations.
Rebuild the English catalog from the edited Word sources and refresh the 28 story WebP illustrations so the live pages match the updated wording.

Co-authored-by: Cursor <cursoragent@cursor.com>
</commit_message>
<xml_diff>
--- a/en/wisdom-stories/blessings-god-has-given.docx
+++ b/en/wisdom-stories/blessings-god-has-given.docx
@@ -10,104 +10,93 @@
         <w:rPr>
           <w:sz w:val="52"/>
         </w:rPr>
-        <w:t>Gifts</w:t>
+        <w:t xml:space="preserve">Gifts given by </w:t>
       </w:r>
       <w:r>
         <w:rPr>
           <w:sz w:val="52"/>
         </w:rPr>
-        <w:t xml:space="preserve"> given by God</w:t>
+        <w:t>Allah</w:t>
       </w:r>
     </w:p>
     <w:p>
-      <w:pPr>
-        <w:rPr>
-          <w:lang/>
-        </w:rPr>
-      </w:pPr>
       <w:r>
-        <w:rPr>
-          <w:lang/>
-        </w:rPr>
-        <w:t>Every gift from God is not only a blessing but also a responsibility. God will surely ask how you used what was entrusted to you:</w:t>
+        <w:t xml:space="preserve">Every gift from </w:t>
+      </w:r>
+      <w:r>
+        <w:t>Allah</w:t>
+      </w:r>
+      <w:r>
+        <w:t xml:space="preserve"> is not only a blessing but also a responsibility. </w:t>
+      </w:r>
+      <w:r>
+        <w:t>Allah</w:t>
+      </w:r>
+      <w:r>
+        <w:t xml:space="preserve"> will surely ask how you used what was entrusted to you:</w:t>
       </w:r>
     </w:p>
     <w:p>
-      <w:pPr>
-        <w:rPr>
-          <w:lang/>
-        </w:rPr>
-      </w:pPr>
       <w:r>
-        <w:rPr>
-          <w:lang/>
-        </w:rPr>
-        <w:t>If He granted you authority—were you just?</w:t>
+        <w:t>If He granted you authority</w:t>
+      </w:r>
+      <w:r>
+        <w:t xml:space="preserve">, </w:t>
+      </w:r>
+      <w:r>
+        <w:t>were you just?</w:t>
       </w:r>
     </w:p>
     <w:p>
-      <w:pPr>
-        <w:rPr>
-          <w:lang/>
-        </w:rPr>
-      </w:pPr>
       <w:r>
-        <w:rPr>
-          <w:lang/>
-        </w:rPr>
-        <w:t>High status—did you show compassion?</w:t>
+        <w:t>High status</w:t>
+      </w:r>
+      <w:r>
+        <w:t xml:space="preserve">, </w:t>
+      </w:r>
+      <w:r>
+        <w:t>did you show compassion?</w:t>
       </w:r>
     </w:p>
     <w:p>
-      <w:pPr>
-        <w:rPr>
-          <w:lang/>
-        </w:rPr>
-      </w:pPr>
       <w:r>
-        <w:rPr>
-          <w:lang/>
-        </w:rPr>
-        <w:t>Wealth—did you remain honest?</w:t>
+        <w:t>Wealth</w:t>
+      </w:r>
+      <w:r>
+        <w:t xml:space="preserve">, </w:t>
+      </w:r>
+      <w:r>
+        <w:t>did you remain honest?</w:t>
       </w:r>
     </w:p>
     <w:p>
-      <w:pPr>
-        <w:rPr>
-          <w:lang/>
-        </w:rPr>
-      </w:pPr>
       <w:r>
-        <w:rPr>
-          <w:lang/>
-        </w:rPr>
-        <w:t>A peaceful life—were you grateful?</w:t>
+        <w:t xml:space="preserve">A peaceful </w:t>
+      </w:r>
+      <w:r>
+        <w:t xml:space="preserve">life, </w:t>
+      </w:r>
+      <w:r>
+        <w:t>were you grateful?</w:t>
       </w:r>
     </w:p>
     <w:p>
-      <w:pPr>
-        <w:rPr>
-          <w:lang/>
-        </w:rPr>
-      </w:pPr>
       <w:r>
-        <w:rPr>
-          <w:lang/>
-        </w:rPr>
-        <w:t>A life partner—were you faithful?</w:t>
+        <w:t>A life partner</w:t>
+      </w:r>
+      <w:r>
+        <w:t xml:space="preserve">, </w:t>
+      </w:r>
+      <w:r>
+        <w:t>were you faithful?</w:t>
       </w:r>
     </w:p>
     <w:p>
-      <w:pPr>
-        <w:rPr>
-          <w:lang/>
-        </w:rPr>
-      </w:pPr>
       <w:r>
-        <w:rPr>
-          <w:lang/>
-        </w:rPr>
-        <w:t>Children—how did you raise them?</w:t>
+        <w:t xml:space="preserve">Children, </w:t>
+      </w:r>
+      <w:r>
+        <w:t>how did you raise them?</w:t>
       </w:r>
     </w:p>
     <w:p>
@@ -140,7 +129,23 @@
           <w:i w:val="0"/>
           <w:color w:val="3F3826"/>
         </w:rPr>
-        <w:t>Every blessing from God carries a responsibility; we honor His gifts by using them with justice, compassion, gratitude, and faithfulness.</w:t>
+        <w:t xml:space="preserve">Every blessing from </w:t>
+      </w:r>
+      <w:r>
+        <w:rPr>
+          <w:rFonts w:cs="Arial"/>
+          <w:i w:val="0"/>
+          <w:color w:val="3F3826"/>
+        </w:rPr>
+        <w:t>Allah</w:t>
+      </w:r>
+      <w:r>
+        <w:rPr>
+          <w:rFonts w:cs="Arial"/>
+          <w:i w:val="0"/>
+          <w:color w:val="3F3826"/>
+        </w:rPr>
+        <w:t xml:space="preserve"> carries a responsibility; we honor His gifts by using them with justice, compassion, gratitude, and faithfulness.</w:t>
       </w:r>
     </w:p>
     <w:p>
@@ -982,6 +987,7 @@
   <w:style w:type="character" w:default="1" w:styleId="DefaultParagraphFont">
     <w:name w:val="Default Paragraph Font"/>
     <w:uiPriority w:val="1"/>
+    <w:semiHidden/>
     <w:unhideWhenUsed/>
   </w:style>
   <w:style w:type="table" w:default="1" w:styleId="TableNormal">

</xml_diff>